<commit_message>
Wire real Mivada logos into the Editorial concept
- Move the supplied logo kit to design-system/assets/logos/ and document it
  (variants + per-background placement; templates fall back to the M chip).
- Editorial 02 now uses the real art on the right pages:
  * deck cover & closing  -> 2C-OnBlack wordmark (coral M + white text)
  * deck content slides    -> small M mark, top-left (Melon on light, White on black)
  * document masthead      -> Master wordmark (coral M + ink text)
  * document footer        -> small Melon M mark
- Implemented in build_pptx.py (_logo helper), presentation.html (.logo + ::before),
  document.html, and build_docx.js (ImageRun); pptx/docx regenerated, docx validates.

https://claude.ai/code/session_018CuPeTbPKyC5roqRrfQGYh
</commit_message>
<xml_diff>
--- a/design-system/02-editorial/editorial.docx
+++ b/design-system/02-editorial/editorial.docx
@@ -8,36 +8,49 @@
           <w:bottom w:val="single" w:color="111111" w:sz="16" w:space="6"/>
         </w:pBdr>
         <w:tabs>
-          <w:tab w:val="right" w:pos="9026"/>
+          <w:tab w:val="right" w:pos="9304"/>
         </w:tabs>
         <w:spacing w:after="60"/>
       </w:pPr>
       <w:r>
-        <w:rPr>
-          <w:rFonts w:ascii="Inter" w:cs="Inter" w:eastAsia="Inter" w:hAnsi="Inter"/>
-          <w:b/>
-          <w:bCs/>
-          <w:color w:val="FFFFFF"/>
-          <w:sz w:val="30"/>
-          <w:szCs w:val="30"/>
-          <w:shd w:fill="EA493F" w:color="auto" w:val="clear"/>
-        </w:rPr>
-        <w:t xml:space="preserve"> M </w:t>
-      </w:r>
-      <w:r>
-        <w:rPr>
-          <w:rFonts w:ascii="Inter" w:cs="Inter" w:eastAsia="Inter" w:hAnsi="Inter"/>
-          <w:b/>
-          <w:bCs/>
-          <w:i w:val="false"/>
-          <w:iCs w:val="false"/>
-          <w:caps w:val="false"/>
-          <w:color w:val="111111"/>
-          <w:spacing w:val="-4"/>
-          <w:sz w:val="30"/>
-          <w:szCs w:val="30"/>
-        </w:rPr>
-        <w:t xml:space="preserve">  Mivada</w:t>
+        <w:drawing>
+          <wp:inline distT="0" distB="0" distL="0" distR="0">
+            <wp:extent cx="1428750" cy="219075"/>
+            <wp:effectExtent t="0" r="0" b="0" l="0"/>
+            <wp:docPr id="1" name="" descr="" title=""/>
+            <wp:cNvGraphicFramePr>
+              <a:graphicFrameLocks xmlns:a="http://schemas.openxmlformats.org/drawingml/2006/main" noChangeAspect="1"/>
+            </wp:cNvGraphicFramePr>
+            <a:graphic xmlns:a="http://schemas.openxmlformats.org/drawingml/2006/main">
+              <a:graphicData uri="http://schemas.openxmlformats.org/drawingml/2006/picture">
+                <pic:pic xmlns:pic="http://schemas.openxmlformats.org/drawingml/2006/picture">
+                  <pic:nvPicPr>
+                    <pic:cNvPr id="0" name="" descr=""/>
+                    <pic:cNvPicPr>
+                      <a:picLocks noChangeAspect="1" noChangeArrowheads="1"/>
+                    </pic:cNvPicPr>
+                  </pic:nvPicPr>
+                  <pic:blipFill>
+                    <a:blip r:embed="rId9" cstate="none"/>
+                    <a:srcRect/>
+                    <a:stretch>
+                      <a:fillRect/>
+                    </a:stretch>
+                  </pic:blipFill>
+                  <pic:spPr bwMode="auto">
+                    <a:xfrm>
+                      <a:off x="0" y="0"/>
+                      <a:ext cx="1428750" cy="219075"/>
+                    </a:xfrm>
+                    <a:prstGeom prst="rect">
+                      <a:avLst/>
+                    </a:prstGeom>
+                  </pic:spPr>
+                </pic:pic>
+              </a:graphicData>
+            </a:graphic>
+          </wp:inline>
+        </w:drawing>
       </w:r>
       <w:r>
         <w:rPr>
@@ -138,7 +151,7 @@
     </w:p>
     <w:tbl>
       <w:tblPr>
-        <w:tblW w:type="dxa" w:w="9026"/>
+        <w:tblW w:type="dxa" w:w="9304"/>
         <w:tblBorders>
           <w:top w:val="none" w:color="FFFFFF" w:sz="0"/>
           <w:left w:val="none" w:color="FFFFFF" w:sz="0"/>
@@ -149,13 +162,13 @@
         </w:tblBorders>
       </w:tblPr>
       <w:tblGrid>
-        <w:gridCol w:w="4513"/>
-        <w:gridCol w:w="4513"/>
+        <w:gridCol w:w="4652"/>
+        <w:gridCol w:w="4652"/>
       </w:tblGrid>
       <w:tr>
         <w:tc>
           <w:tcPr>
-            <w:tcW w:type="dxa" w:w="4513"/>
+            <w:tcW w:type="dxa" w:w="4652"/>
             <w:tcBorders>
               <w:top w:val="none" w:color="FFFFFF" w:sz="0"/>
               <w:left w:val="none" w:color="FFFFFF" w:sz="0"/>
@@ -192,7 +205,7 @@
         </w:tc>
         <w:tc>
           <w:tcPr>
-            <w:tcW w:type="dxa" w:w="4513"/>
+            <w:tcW w:type="dxa" w:w="4652"/>
             <w:tcBorders>
               <w:top w:val="none" w:color="FFFFFF" w:sz="0"/>
               <w:left w:val="none" w:color="FFFFFF" w:sz="0"/>
@@ -286,7 +299,7 @@
     </w:p>
     <w:tbl>
       <w:tblPr>
-        <w:tblW w:type="dxa" w:w="9026"/>
+        <w:tblW w:type="dxa" w:w="9304"/>
         <w:tblBorders>
           <w:top w:val="none" w:color="FFFFFF" w:sz="0"/>
           <w:left w:val="none" w:color="FFFFFF" w:sz="0"/>
@@ -297,13 +310,13 @@
         </w:tblBorders>
       </w:tblPr>
       <w:tblGrid>
-        <w:gridCol w:w="4513"/>
-        <w:gridCol w:w="4513"/>
+        <w:gridCol w:w="4652"/>
+        <w:gridCol w:w="4652"/>
       </w:tblGrid>
       <w:tr>
         <w:tc>
           <w:tcPr>
-            <w:tcW w:type="dxa" w:w="4513"/>
+            <w:tcW w:type="dxa" w:w="4652"/>
             <w:tcBorders>
               <w:top w:val="single" w:color="E4E4E0" w:sz="6"/>
               <w:left w:val="none" w:color="FFFFFF" w:sz="0"/>
@@ -373,7 +386,7 @@
         </w:tc>
         <w:tc>
           <w:tcPr>
-            <w:tcW w:type="dxa" w:w="4513"/>
+            <w:tcW w:type="dxa" w:w="4652"/>
             <w:tcBorders>
               <w:top w:val="single" w:color="E4E4E0" w:sz="6"/>
               <w:left w:val="none" w:color="FFFFFF" w:sz="0"/>
@@ -445,7 +458,7 @@
       <w:tr>
         <w:tc>
           <w:tcPr>
-            <w:tcW w:type="dxa" w:w="4513"/>
+            <w:tcW w:type="dxa" w:w="4652"/>
             <w:tcBorders>
               <w:top w:val="single" w:color="E4E4E0" w:sz="6"/>
               <w:left w:val="none" w:color="FFFFFF" w:sz="0"/>
@@ -515,7 +528,7 @@
         </w:tc>
         <w:tc>
           <w:tcPr>
-            <w:tcW w:type="dxa" w:w="4513"/>
+            <w:tcW w:type="dxa" w:w="4652"/>
             <w:tcBorders>
               <w:top w:val="single" w:color="E4E4E0" w:sz="6"/>
               <w:left w:val="none" w:color="FFFFFF" w:sz="0"/>
@@ -642,7 +655,7 @@
     </w:p>
     <w:tbl>
       <w:tblPr>
-        <w:tblW w:type="dxa" w:w="9026"/>
+        <w:tblW w:type="dxa" w:w="9304"/>
         <w:tblBorders>
           <w:top w:val="none" w:color="FFFFFF" w:sz="0"/>
           <w:left w:val="none" w:color="FFFFFF" w:sz="0"/>
@@ -653,15 +666,15 @@
         </w:tblBorders>
       </w:tblPr>
       <w:tblGrid>
-        <w:gridCol w:w="2256"/>
-        <w:gridCol w:w="2256"/>
-        <w:gridCol w:w="2256"/>
-        <w:gridCol w:w="2256"/>
+        <w:gridCol w:w="2326"/>
+        <w:gridCol w:w="2326"/>
+        <w:gridCol w:w="2326"/>
+        <w:gridCol w:w="2326"/>
       </w:tblGrid>
       <w:tr>
         <w:tc>
           <w:tcPr>
-            <w:tcW w:type="dxa" w:w="2256"/>
+            <w:tcW w:type="dxa" w:w="2326"/>
             <w:tcBorders>
               <w:top w:val="none" w:color="FFFFFF" w:sz="0"/>
               <w:left w:val="none" w:color="FFFFFF" w:sz="0"/>
@@ -737,7 +750,7 @@
         </w:tc>
         <w:tc>
           <w:tcPr>
-            <w:tcW w:type="dxa" w:w="2256"/>
+            <w:tcW w:type="dxa" w:w="2326"/>
             <w:tcBorders>
               <w:top w:val="none" w:color="FFFFFF" w:sz="0"/>
               <w:left w:val="single" w:color="E4E4E0" w:sz="6"/>
@@ -813,7 +826,7 @@
         </w:tc>
         <w:tc>
           <w:tcPr>
-            <w:tcW w:type="dxa" w:w="2256"/>
+            <w:tcW w:type="dxa" w:w="2326"/>
             <w:tcBorders>
               <w:top w:val="none" w:color="FFFFFF" w:sz="0"/>
               <w:left w:val="single" w:color="E4E4E0" w:sz="6"/>
@@ -889,7 +902,7 @@
         </w:tc>
         <w:tc>
           <w:tcPr>
-            <w:tcW w:type="dxa" w:w="2256"/>
+            <w:tcW w:type="dxa" w:w="2326"/>
             <w:tcBorders>
               <w:top w:val="none" w:color="FFFFFF" w:sz="0"/>
               <w:left w:val="single" w:color="E4E4E0" w:sz="6"/>
@@ -986,7 +999,7 @@
     </w:p>
     <w:tbl>
       <w:tblPr>
-        <w:tblW w:type="dxa" w:w="9026"/>
+        <w:tblW w:type="dxa" w:w="9304"/>
         <w:tblBorders>
           <w:top w:val="none" w:color="FFFFFF" w:sz="0"/>
           <w:left w:val="none" w:color="FFFFFF" w:sz="0"/>
@@ -997,12 +1010,12 @@
         </w:tblBorders>
       </w:tblPr>
       <w:tblGrid>
-        <w:gridCol w:w="9026"/>
+        <w:gridCol w:w="9304"/>
       </w:tblGrid>
       <w:tr>
         <w:tc>
           <w:tcPr>
-            <w:tcW w:type="dxa" w:w="9026"/>
+            <w:tcW w:type="dxa" w:w="9304"/>
             <w:tcBorders>
               <w:top w:val="none" w:color="FFFFFF" w:sz="0"/>
               <w:left w:val="none" w:color="FFFFFF" w:sz="0"/>
@@ -1433,7 +1446,7 @@
     </w:p>
     <w:tbl>
       <w:tblPr>
-        <w:tblW w:type="dxa" w:w="9026"/>
+        <w:tblW w:type="dxa" w:w="9304"/>
         <w:tblBorders>
           <w:top w:val="none" w:color="FFFFFF" w:sz="0"/>
           <w:left w:val="none" w:color="FFFFFF" w:sz="0"/>
@@ -1444,15 +1457,15 @@
         </w:tblBorders>
       </w:tblPr>
       <w:tblGrid>
-        <w:gridCol w:w="2256"/>
-        <w:gridCol w:w="2256"/>
-        <w:gridCol w:w="2256"/>
-        <w:gridCol w:w="2256"/>
+        <w:gridCol w:w="2326"/>
+        <w:gridCol w:w="2326"/>
+        <w:gridCol w:w="2326"/>
+        <w:gridCol w:w="2326"/>
       </w:tblGrid>
       <w:tr>
         <w:tc>
           <w:tcPr>
-            <w:tcW w:type="dxa" w:w="2256"/>
+            <w:tcW w:type="dxa" w:w="2326"/>
             <w:tcBorders>
               <w:top w:val="none" w:color="FFFFFF" w:sz="0"/>
               <w:left w:val="none" w:color="FFFFFF" w:sz="0"/>
@@ -1522,7 +1535,7 @@
         </w:tc>
         <w:tc>
           <w:tcPr>
-            <w:tcW w:type="dxa" w:w="2256"/>
+            <w:tcW w:type="dxa" w:w="2326"/>
             <w:tcBorders>
               <w:top w:val="none" w:color="FFFFFF" w:sz="0"/>
               <w:left w:val="single" w:color="E4E4E0" w:sz="6"/>
@@ -1592,7 +1605,7 @@
         </w:tc>
         <w:tc>
           <w:tcPr>
-            <w:tcW w:type="dxa" w:w="2256"/>
+            <w:tcW w:type="dxa" w:w="2326"/>
             <w:tcBorders>
               <w:top w:val="none" w:color="FFFFFF" w:sz="0"/>
               <w:left w:val="single" w:color="E4E4E0" w:sz="6"/>
@@ -1662,7 +1675,7 @@
         </w:tc>
         <w:tc>
           <w:tcPr>
-            <w:tcW w:type="dxa" w:w="2256"/>
+            <w:tcW w:type="dxa" w:w="2326"/>
             <w:tcBorders>
               <w:top w:val="none" w:color="FFFFFF" w:sz="0"/>
               <w:left w:val="single" w:color="E4E4E0" w:sz="6"/>
@@ -1721,7 +1734,7 @@
       <w:headerReference w:type="default" r:id="rId7"/>
       <w:footerReference w:type="default" r:id="rId8"/>
       <w:pgSz w:w="11906" w:h="16838" w:orient="portrait"/>
-      <w:pgMar w:top="1340" w:right="1440" w:bottom="1180" w:left="1440" w:header="708" w:footer="708" w:gutter="0"/>
+      <w:pgMar w:top="1120" w:right="1300" w:bottom="1000" w:left="1300" w:header="708" w:footer="708" w:gutter="0"/>
       <w:pgNumType/>
       <w:docGrid w:linePitch="360"/>
     </w:sectPr>
@@ -1778,7 +1791,7 @@
         <w:top w:val="single" w:color="E4E4E0" w:sz="6" w:space="6"/>
       </w:pBdr>
       <w:tabs>
-        <w:tab w:val="right" w:pos="9026"/>
+        <w:tab w:val="right" w:pos="9304"/>
       </w:tabs>
     </w:pPr>
     <w:r>
@@ -1868,7 +1881,7 @@
   <w:p>
     <w:pPr>
       <w:tabs>
-        <w:tab w:val="right" w:pos="9026"/>
+        <w:tab w:val="right" w:pos="9304"/>
       </w:tabs>
       <w:spacing w:after="0"/>
     </w:pPr>

</xml_diff>